<commit_message>
Add Scrum Master hat (BPC/BA) across role docs + presentation layer; README; navigator
</commit_message>
<xml_diff>
--- a/05_Clients/Connection/01_Onboarding/Internal_Team/Connection_Role_and_Accountability_QuickRef.docx
+++ b/05_Clients/Connection/01_Onboarding/Internal_Team/Connection_Role_and_Accountability_QuickRef.docx
@@ -421,7 +421,7 @@
                 <w:rFonts w:ascii="Calibri" w:hAnsi="Calibri"/>
                 <w:sz w:val="20"/>
               </w:rPr>
-              <w:t>Process Consultant (PC)</w:t>
+              <w:t>Process Consultant / BA (PC) - also Scrum Master</w:t>
             </w:r>
           </w:p>
         </w:tc>
@@ -452,7 +452,7 @@
                 <w:rFonts w:ascii="Calibri" w:hAnsi="Calibri"/>
                 <w:sz w:val="20"/>
               </w:rPr>
-              <w:t>Workshop facilitation; requirements-to-stories; sprint cadence; story-level Definition of Done.</w:t>
+              <w:t>Workshop facilitation; requirements-to-stories; sprint cadence and ceremonies; Definition of Ready / Done; velocity &amp; burndown; impediment removal.</w:t>
             </w:r>
           </w:p>
         </w:tc>
@@ -748,7 +748,7 @@
         <w:pStyle w:val="Heading1"/>
       </w:pPr>
       <w:r>
-        <w:t>4.  Process Consultant (PC)</w:t>
+        <w:t>4.  Process Consultant / BA (PC) - also Scrum Master</w:t>
       </w:r>
     </w:p>
     <w:p>
@@ -761,7 +761,7 @@
           <w:color w:val="1A1A1A"/>
           <w:sz w:val="22"/>
         </w:rPr>
-        <w:t>You run the workshops where the OOTB discipline is won or lost, and you turn requirements into signed-off stories.</w:t>
+        <w:t>You run the workshops where the OOTB discipline is won or lost, and you turn requirements into signed-off stories. You also wear the Scrum Master hat: you run the ceremonies and protect the sprint.</w:t>
       </w:r>
     </w:p>
     <w:p>
@@ -775,7 +775,7 @@
           <w:rFonts w:ascii="Calibri" w:hAnsi="Calibri"/>
           <w:sz w:val="22"/>
         </w:rPr>
-        <w:t>Core reading: Decision Topic Guides and Workshop Pre-Reads for the in-scope processes.</w:t>
+        <w:t>Core reading: Decision Topic Guides and Workshop Pre-Reads for the in-scope processes; the Sprint Operating Kit.</w:t>
       </w:r>
     </w:p>
     <w:p>
@@ -817,7 +817,35 @@
           <w:rFonts w:ascii="Calibri" w:hAnsi="Calibri"/>
           <w:sz w:val="22"/>
         </w:rPr>
-        <w:t>Your check: each workshop ends with a signed-off story, not a list of "things to think about."</w:t>
+        <w:t>As Scrum Master: run planning, standup, demo, and retro; enforce Definition of Ready / Done; own velocity and burndown; remove impediments and escalate the rest to the EM; shield the sprint from mid-sprint scope.</w:t>
+      </w:r>
+    </w:p>
+    <w:p>
+      <w:pPr>
+        <w:pStyle w:val="ListBullet"/>
+        <w:spacing w:after="40"/>
+        <w:ind w:left="360"/>
+      </w:pPr>
+      <w:r>
+        <w:rPr>
+          <w:rFonts w:ascii="Calibri" w:hAnsi="Calibri"/>
+          <w:sz w:val="22"/>
+        </w:rPr>
+        <w:t>Your check: each workshop ends with a signed-off story, not a list of "things to think about" - and each sprint ends on its commitment or names why it did not.</w:t>
+      </w:r>
+    </w:p>
+    <w:p>
+      <w:pPr>
+        <w:pStyle w:val="ListBullet"/>
+        <w:spacing w:after="40"/>
+        <w:ind w:left="360"/>
+      </w:pPr>
+      <w:r>
+        <w:rPr>
+          <w:rFonts w:ascii="Calibri" w:hAnsi="Calibri"/>
+          <w:sz w:val="22"/>
+        </w:rPr>
+        <w:t>Neutrality: you both write stories and serve as Scrum Master; when those pull apart under scope pressure, the EM and Practice Lead are the check.</w:t>
       </w:r>
     </w:p>
     <w:p>

</xml_diff>